<commit_message>
feat: Word-built equations end to end; IDML refuses them (equations P6)
corpus/word/word-equation.docx is rebuilt through Word: the inline
equation it had, five displayed ones (a sum, the quadratic formula with
a square root, a cube root, a matrix, functions; Greek throughout) and
one typed into a sentence as a tracked insertion. Ingest pins each one's
MathML text, the gate test runs it, and Typst draws all seven as the CSS
path sends them.

The IDML deliverable refuses a book with equations: ICML has none, and
pandoc would flatten them to their characters (idml v9).

Docs: REMAINING_WORK §3.1 and W11 record what landed and what did not
(equation numbers and labels; Word's legacy OLE equations, still counted
and reported as objects). The corpus skill no longer says the synthetic
technical book holds equations: it holds none.
</commit_message>
<xml_diff>
--- a/corpus/word/word-equation.docx
+++ b/corpus/word/word-equation.docx
@@ -84,6 +84,432 @@
           <w:rFonts w:eastAsiaTheme="minorEastAsia"/>
         </w:rPr>
         <w:t>.</w:t>
+      </w:r>
+    </w:p>
+    <w:p>
+      <w:r>
+        <w:t>Summed over every wave in the train, the energy is</w:t>
+      </w:r>
+    </w:p>
+    <w:p>
+      <w:pPr>
+        <w:rPr>
+          <w:rFonts w:eastAsiaTheme="minorEastAsia"/>
+        </w:rPr>
+      </w:pPr>
+      <m:oMathPara>
+        <m:oMath>
+          <m:nary>
+            <m:naryPr>
+              <m:chr m:val="∑"/>
+              <m:ctrlPr>
+                <w:rPr>
+                  <w:rFonts w:ascii="Cambria Math" w:hAnsi="Cambria Math"/>
+                  <w:i/>
+                </w:rPr>
+              </m:ctrlPr>
+            </m:naryPr>
+            <m:sub>
+              <m:r>
+                <w:rPr>
+                  <w:rFonts w:ascii="Cambria Math" w:hAnsi="Cambria Math"/>
+                </w:rPr>
+                <m:t>i=1</m:t>
+              </m:r>
+            </m:sub>
+            <m:sup>
+              <m:r>
+                <w:rPr>
+                  <w:rFonts w:ascii="Cambria Math" w:hAnsi="Cambria Math"/>
+                </w:rPr>
+                <m:t>n</m:t>
+              </m:r>
+            </m:sup>
+            <m:e>
+              <m:sSub>
+                <m:sSubPr>
+                  <m:ctrlPr>
+                    <w:rPr>
+                      <w:rFonts w:ascii="Cambria Math" w:hAnsi="Cambria Math"/>
+                      <w:i/>
+                    </w:rPr>
+                  </m:ctrlPr>
+                </m:sSubPr>
+                <m:e>
+                  <m:r>
+                    <w:rPr>
+                      <w:rFonts w:ascii="Cambria Math" w:hAnsi="Cambria Math"/>
+                    </w:rPr>
+                    <m:t>E</m:t>
+                  </m:r>
+                  <m:ctrlPr>
+                    <w:rPr>
+                      <w:rFonts w:ascii="Cambria Math" w:hAnsi="Cambria Math" w:cs="Arial"/>
+                      <w:i/>
+                    </w:rPr>
+                  </m:ctrlPr>
+                </m:e>
+                <m:sub>
+                  <m:r>
+                    <w:rPr>
+                      <w:rFonts w:ascii="Cambria Math" w:hAnsi="Cambria Math"/>
+                    </w:rPr>
+                    <m:t>i</m:t>
+                  </m:r>
+                </m:sub>
+              </m:sSub>
+              <m:ctrlPr>
+                <w:rPr>
+                  <w:rFonts w:ascii="Cambria Math" w:hAnsi="Cambria Math" w:cs="Arial"/>
+                  <w:i/>
+                </w:rPr>
+              </m:ctrlPr>
+            </m:e>
+          </m:nary>
+        </m:oMath>
+      </m:oMathPara>
+    </w:p>
+    <w:p>
+      <w:pPr>
+        <w:rPr>
+          <w:rFonts w:eastAsiaTheme="minorEastAsia"/>
+        </w:rPr>
+      </w:pPr>
+      <m:oMathPara>
+        <m:oMath>
+          <m:r>
+            <w:rPr>
+              <w:rFonts w:ascii="Cambria Math" w:hAnsi="Cambria Math"/>
+            </w:rPr>
+            <m:t>x=</m:t>
+          </m:r>
+          <m:f>
+            <m:fPr>
+              <m:ctrlPr>
+                <w:rPr>
+                  <w:rFonts w:ascii="Cambria Math" w:hAnsi="Cambria Math"/>
+                  <w:i/>
+                </w:rPr>
+              </m:ctrlPr>
+            </m:fPr>
+            <m:num>
+              <m:r>
+                <w:rPr>
+                  <w:rFonts w:ascii="Cambria Math" w:hAnsi="Cambria Math"/>
+                </w:rPr>
+                <m:t>-b±</m:t>
+              </m:r>
+              <m:rad>
+                <m:radPr>
+                  <m:degHide m:val="1"/>
+                  <m:ctrlPr>
+                    <w:rPr>
+                      <w:rFonts w:ascii="Cambria Math" w:hAnsi="Cambria Math"/>
+                      <w:i/>
+                    </w:rPr>
+                  </m:ctrlPr>
+                </m:radPr>
+                <m:deg/>
+                <m:e>
+                  <m:sSup>
+                    <m:sSupPr>
+                      <m:ctrlPr>
+                        <w:rPr>
+                          <w:rFonts w:ascii="Cambria Math" w:hAnsi="Cambria Math"/>
+                          <w:i/>
+                        </w:rPr>
+                      </m:ctrlPr>
+                    </m:sSupPr>
+                    <m:e>
+                      <m:r>
+                        <w:rPr>
+                          <w:rFonts w:ascii="Cambria Math" w:hAnsi="Cambria Math"/>
+                        </w:rPr>
+                        <m:t>b</m:t>
+                      </m:r>
+                    </m:e>
+                    <m:sup>
+                      <m:r>
+                        <w:rPr>
+                          <w:rFonts w:ascii="Cambria Math" w:hAnsi="Cambria Math"/>
+                        </w:rPr>
+                        <m:t>2</m:t>
+                      </m:r>
+                    </m:sup>
+                  </m:sSup>
+                  <m:r>
+                    <w:rPr>
+                      <w:rFonts w:ascii="Cambria Math" w:hAnsi="Cambria Math"/>
+                    </w:rPr>
+                    <m:t>-4ac</m:t>
+                  </m:r>
+                </m:e>
+              </m:rad>
+            </m:num>
+            <m:den>
+              <m:r>
+                <w:rPr>
+                  <w:rFonts w:ascii="Cambria Math" w:hAnsi="Cambria Math"/>
+                </w:rPr>
+                <m:t>2a</m:t>
+              </m:r>
+            </m:den>
+          </m:f>
+        </m:oMath>
+      </m:oMathPara>
+    </w:p>
+    <w:p>
+      <w:pPr>
+        <w:rPr>
+          <w:rFonts w:eastAsiaTheme="minorEastAsia"/>
+        </w:rPr>
+      </w:pPr>
+      <m:oMathPara>
+        <m:oMath>
+          <m:rad>
+            <m:radPr>
+              <m:ctrlPr>
+                <w:rPr>
+                  <w:rFonts w:ascii="Cambria Math" w:hAnsi="Cambria Math" w:cs="Cambria Math"/>
+                  <w:i/>
+                </w:rPr>
+              </m:ctrlPr>
+            </m:radPr>
+            <m:deg>
+              <m:r>
+                <w:rPr>
+                  <w:rFonts w:ascii="Cambria Math" w:hAnsi="Cambria Math"/>
+                </w:rPr>
+                <m:t>3</m:t>
+              </m:r>
+              <m:ctrlPr>
+                <w:rPr>
+                  <w:rFonts w:ascii="Cambria Math" w:hAnsi="Cambria Math"/>
+                  <w:i/>
+                </w:rPr>
+              </m:ctrlPr>
+            </m:deg>
+            <m:e>
+              <m:r>
+                <w:rPr>
+                  <w:rFonts w:ascii="Cambria Math" w:hAnsi="Cambria Math"/>
+                </w:rPr>
+                <m:t>α+β</m:t>
+              </m:r>
+            </m:e>
+          </m:rad>
+          <m:r>
+            <w:rPr>
+              <w:rFonts w:ascii="Cambria Math" w:hAnsi="Cambria Math"/>
+            </w:rPr>
+            <m:t>=γ</m:t>
+          </m:r>
+        </m:oMath>
+      </m:oMathPara>
+    </w:p>
+    <w:p>
+      <w:pPr>
+        <w:rPr>
+          <w:rFonts w:eastAsiaTheme="minorEastAsia"/>
+        </w:rPr>
+      </w:pPr>
+      <m:oMathPara>
+        <m:oMath>
+          <m:d>
+            <m:dPr>
+              <m:ctrlPr>
+                <w:rPr>
+                  <w:rFonts w:ascii="Cambria Math" w:hAnsi="Cambria Math"/>
+                  <w:i/>
+                </w:rPr>
+              </m:ctrlPr>
+            </m:dPr>
+            <m:e>
+              <m:m>
+                <m:mPr>
+                  <m:mcs>
+                    <m:mc>
+                      <m:mcPr>
+                        <m:count m:val="2"/>
+                        <m:mcJc m:val="center"/>
+                      </m:mcPr>
+                    </m:mc>
+                  </m:mcs>
+                  <m:ctrlPr>
+                    <w:rPr>
+                      <w:rFonts w:ascii="Cambria Math" w:hAnsi="Cambria Math" w:cs="Arial"/>
+                      <w:i/>
+                    </w:rPr>
+                  </m:ctrlPr>
+                </m:mPr>
+                <m:mr>
+                  <m:e>
+                    <m:r>
+                      <w:rPr>
+                        <w:rFonts w:ascii="Cambria Math" w:hAnsi="Cambria Math"/>
+                      </w:rPr>
+                      <m:t>1</m:t>
+                    </m:r>
+                    <m:ctrlPr>
+                      <w:rPr>
+                        <w:rFonts w:ascii="Cambria Math" w:hAnsi="Cambria Math"/>
+                        <w:i/>
+                      </w:rPr>
+                    </m:ctrlPr>
+                  </m:e>
+                  <m:e>
+                    <m:r>
+                      <w:rPr>
+                        <w:rFonts w:ascii="Cambria Math" w:hAnsi="Cambria Math"/>
+                      </w:rPr>
+                      <m:t>0</m:t>
+                    </m:r>
+                    <m:ctrlPr>
+                      <w:rPr>
+                        <w:rFonts w:ascii="Cambria Math" w:hAnsi="Cambria Math"/>
+                        <w:i/>
+                      </w:rPr>
+                    </m:ctrlPr>
+                  </m:e>
+                </m:mr>
+                <m:mr>
+                  <m:e>
+                    <m:r>
+                      <w:rPr>
+                        <w:rFonts w:ascii="Cambria Math" w:hAnsi="Cambria Math"/>
+                      </w:rPr>
+                      <m:t>0</m:t>
+                    </m:r>
+                    <m:ctrlPr>
+                      <w:rPr>
+                        <w:rFonts w:ascii="Cambria Math" w:hAnsi="Cambria Math"/>
+                        <w:i/>
+                      </w:rPr>
+                    </m:ctrlPr>
+                  </m:e>
+                  <m:e>
+                    <m:r>
+                      <w:rPr>
+                        <w:rFonts w:ascii="Cambria Math" w:hAnsi="Cambria Math"/>
+                      </w:rPr>
+                      <m:t>1</m:t>
+                    </m:r>
+                    <m:ctrlPr>
+                      <w:rPr>
+                        <w:rFonts w:ascii="Cambria Math" w:hAnsi="Cambria Math"/>
+                        <w:i/>
+                      </w:rPr>
+                    </m:ctrlPr>
+                  </m:e>
+                </m:mr>
+              </m:m>
+            </m:e>
+          </m:d>
+        </m:oMath>
+      </m:oMathPara>
+    </w:p>
+    <w:p>
+      <w:pPr>
+        <w:rPr>
+          <w:rFonts w:eastAsiaTheme="minorEastAsia"/>
+        </w:rPr>
+      </w:pPr>
+      <m:oMathPara>
+        <m:oMath>
+          <m:func>
+            <m:funcPr>
+              <m:ctrlPr>
+                <w:rPr>
+                  <w:rFonts w:ascii="Cambria Math" w:hAnsi="Cambria Math" w:cs="Cambria Math"/>
+                  <w:i/>
+                </w:rPr>
+              </m:ctrlPr>
+            </m:funcPr>
+            <m:fName>
+              <m:r>
+                <m:rPr>
+                  <m:sty m:val="p"/>
+                </m:rPr>
+                <w:rPr>
+                  <w:rFonts w:ascii="Cambria Math" w:hAnsi="Cambria Math"/>
+                </w:rPr>
+                <m:t>sin</m:t>
+              </m:r>
+              <m:ctrlPr>
+                <w:rPr>
+                  <w:rFonts w:ascii="Cambria Math" w:hAnsi="Cambria Math"/>
+                </w:rPr>
+              </m:ctrlPr>
+            </m:fName>
+            <m:e>
+              <m:r>
+                <w:rPr>
+                  <w:rFonts w:ascii="Cambria Math" w:hAnsi="Cambria Math" w:cs="Aptos"/>
+                </w:rPr>
+                <m:t>θ</m:t>
+              </m:r>
+            </m:e>
+          </m:func>
+          <m:r>
+            <w:rPr>
+              <w:rFonts w:ascii="Cambria Math" w:hAnsi="Cambria Math"/>
+            </w:rPr>
+            <m:t>+</m:t>
+          </m:r>
+          <m:func>
+            <m:funcPr>
+              <m:ctrlPr>
+                <w:rPr>
+                  <w:rFonts w:ascii="Cambria Math" w:hAnsi="Cambria Math" w:cs="Cambria Math"/>
+                  <w:i/>
+                </w:rPr>
+              </m:ctrlPr>
+            </m:funcPr>
+            <m:fName>
+              <m:r>
+                <m:rPr>
+                  <m:sty m:val="p"/>
+                </m:rPr>
+                <w:rPr>
+                  <w:rFonts w:ascii="Cambria Math" w:hAnsi="Cambria Math"/>
+                </w:rPr>
+                <m:t>cos</m:t>
+              </m:r>
+              <m:ctrlPr>
+                <w:rPr>
+                  <w:rFonts w:ascii="Cambria Math" w:hAnsi="Cambria Math"/>
+                  <w:i/>
+                </w:rPr>
+              </m:ctrlPr>
+            </m:fName>
+            <m:e>
+              <m:r>
+                <w:rPr>
+                  <w:rFonts w:ascii="Cambria Math" w:hAnsi="Cambria Math"/>
+                </w:rPr>
+                <m:t>θ</m:t>
+              </m:r>
+            </m:e>
+          </m:func>
+        </m:oMath>
+      </m:oMathPara>
+    </w:p>
+    <w:p>
+      <w:r>
+        <w:t xml:space="preserve">A tracked edit added </w:t>
+      </w:r>
+      <m:oMath>
+        <m:r>
+          <w:ins w:id="0" w:author="Author" w:date="2026-10-17T02:46:00Z" w16du:dateUtc="2026-10-16T23:46:00Z">
+            <w:rPr>
+              <w:rFonts w:ascii="Cambria Math" w:hAnsi="Cambria Math"/>
+            </w:rPr>
+            <m:t>y=2x</m:t>
+          </w:ins>
+        </m:r>
+      </m:oMath>
+      <w:r>
+        <w:t xml:space="preserve"> to this sentence.</w:t>
       </w:r>
     </w:p>
     <w:p/>
@@ -505,7 +931,7 @@
     <w:link w:val="Heading1Char"/>
     <w:uiPriority w:val="9"/>
     <w:qFormat/>
-    <w:rsid w:val="00212C13"/>
+    <w:rsid w:val="00D37C3A"/>
     <w:pPr>
       <w:keepNext/>
       <w:keepLines/>
@@ -528,7 +954,7 @@
     <w:semiHidden/>
     <w:unhideWhenUsed/>
     <w:qFormat/>
-    <w:rsid w:val="00212C13"/>
+    <w:rsid w:val="00D37C3A"/>
     <w:pPr>
       <w:keepNext/>
       <w:keepLines/>
@@ -551,7 +977,7 @@
     <w:semiHidden/>
     <w:unhideWhenUsed/>
     <w:qFormat/>
-    <w:rsid w:val="00212C13"/>
+    <w:rsid w:val="00D37C3A"/>
     <w:pPr>
       <w:keepNext/>
       <w:keepLines/>
@@ -574,7 +1000,7 @@
     <w:semiHidden/>
     <w:unhideWhenUsed/>
     <w:qFormat/>
-    <w:rsid w:val="00212C13"/>
+    <w:rsid w:val="00D37C3A"/>
     <w:pPr>
       <w:keepNext/>
       <w:keepLines/>
@@ -597,7 +1023,7 @@
     <w:semiHidden/>
     <w:unhideWhenUsed/>
     <w:qFormat/>
-    <w:rsid w:val="00212C13"/>
+    <w:rsid w:val="00D37C3A"/>
     <w:pPr>
       <w:keepNext/>
       <w:keepLines/>
@@ -618,7 +1044,7 @@
     <w:semiHidden/>
     <w:unhideWhenUsed/>
     <w:qFormat/>
-    <w:rsid w:val="00212C13"/>
+    <w:rsid w:val="00D37C3A"/>
     <w:pPr>
       <w:keepNext/>
       <w:keepLines/>
@@ -641,7 +1067,7 @@
     <w:semiHidden/>
     <w:unhideWhenUsed/>
     <w:qFormat/>
-    <w:rsid w:val="00212C13"/>
+    <w:rsid w:val="00D37C3A"/>
     <w:pPr>
       <w:keepNext/>
       <w:keepLines/>
@@ -662,7 +1088,7 @@
     <w:semiHidden/>
     <w:unhideWhenUsed/>
     <w:qFormat/>
-    <w:rsid w:val="00212C13"/>
+    <w:rsid w:val="00D37C3A"/>
     <w:pPr>
       <w:keepNext/>
       <w:keepLines/>
@@ -685,7 +1111,7 @@
     <w:semiHidden/>
     <w:unhideWhenUsed/>
     <w:qFormat/>
-    <w:rsid w:val="00212C13"/>
+    <w:rsid w:val="00D37C3A"/>
     <w:pPr>
       <w:keepNext/>
       <w:keepLines/>
@@ -729,7 +1155,7 @@
     <w:basedOn w:val="DefaultParagraphFont"/>
     <w:link w:val="Heading1"/>
     <w:uiPriority w:val="9"/>
-    <w:rsid w:val="00212C13"/>
+    <w:rsid w:val="00D37C3A"/>
     <w:rPr>
       <w:rFonts w:asciiTheme="majorHAnsi" w:eastAsiaTheme="majorEastAsia" w:hAnsiTheme="majorHAnsi" w:cstheme="majorBidi"/>
       <w:color w:val="0F4761" w:themeColor="accent1" w:themeShade="BF"/>
@@ -743,7 +1169,7 @@
     <w:link w:val="Heading2"/>
     <w:uiPriority w:val="9"/>
     <w:semiHidden/>
-    <w:rsid w:val="00212C13"/>
+    <w:rsid w:val="00D37C3A"/>
     <w:rPr>
       <w:rFonts w:asciiTheme="majorHAnsi" w:eastAsiaTheme="majorEastAsia" w:hAnsiTheme="majorHAnsi" w:cstheme="majorBidi"/>
       <w:color w:val="0F4761" w:themeColor="accent1" w:themeShade="BF"/>
@@ -757,7 +1183,7 @@
     <w:link w:val="Heading3"/>
     <w:uiPriority w:val="9"/>
     <w:semiHidden/>
-    <w:rsid w:val="00212C13"/>
+    <w:rsid w:val="00D37C3A"/>
     <w:rPr>
       <w:rFonts w:eastAsiaTheme="majorEastAsia" w:cstheme="majorBidi"/>
       <w:color w:val="0F4761" w:themeColor="accent1" w:themeShade="BF"/>
@@ -771,7 +1197,7 @@
     <w:link w:val="Heading4"/>
     <w:uiPriority w:val="9"/>
     <w:semiHidden/>
-    <w:rsid w:val="00212C13"/>
+    <w:rsid w:val="00D37C3A"/>
     <w:rPr>
       <w:rFonts w:eastAsiaTheme="majorEastAsia" w:cstheme="majorBidi"/>
       <w:i/>
@@ -785,7 +1211,7 @@
     <w:link w:val="Heading5"/>
     <w:uiPriority w:val="9"/>
     <w:semiHidden/>
-    <w:rsid w:val="00212C13"/>
+    <w:rsid w:val="00D37C3A"/>
     <w:rPr>
       <w:rFonts w:eastAsiaTheme="majorEastAsia" w:cstheme="majorBidi"/>
       <w:color w:val="0F4761" w:themeColor="accent1" w:themeShade="BF"/>
@@ -797,7 +1223,7 @@
     <w:link w:val="Heading6"/>
     <w:uiPriority w:val="9"/>
     <w:semiHidden/>
-    <w:rsid w:val="00212C13"/>
+    <w:rsid w:val="00D37C3A"/>
     <w:rPr>
       <w:rFonts w:eastAsiaTheme="majorEastAsia" w:cstheme="majorBidi"/>
       <w:i/>
@@ -811,7 +1237,7 @@
     <w:link w:val="Heading7"/>
     <w:uiPriority w:val="9"/>
     <w:semiHidden/>
-    <w:rsid w:val="00212C13"/>
+    <w:rsid w:val="00D37C3A"/>
     <w:rPr>
       <w:rFonts w:eastAsiaTheme="majorEastAsia" w:cstheme="majorBidi"/>
       <w:color w:val="595959" w:themeColor="text1" w:themeTint="A6"/>
@@ -823,7 +1249,7 @@
     <w:link w:val="Heading8"/>
     <w:uiPriority w:val="9"/>
     <w:semiHidden/>
-    <w:rsid w:val="00212C13"/>
+    <w:rsid w:val="00D37C3A"/>
     <w:rPr>
       <w:rFonts w:eastAsiaTheme="majorEastAsia" w:cstheme="majorBidi"/>
       <w:i/>
@@ -837,7 +1263,7 @@
     <w:link w:val="Heading9"/>
     <w:uiPriority w:val="9"/>
     <w:semiHidden/>
-    <w:rsid w:val="00212C13"/>
+    <w:rsid w:val="00D37C3A"/>
     <w:rPr>
       <w:rFonts w:eastAsiaTheme="majorEastAsia" w:cstheme="majorBidi"/>
       <w:color w:val="272727" w:themeColor="text1" w:themeTint="D8"/>
@@ -850,7 +1276,7 @@
     <w:link w:val="TitleChar"/>
     <w:uiPriority w:val="10"/>
     <w:qFormat/>
-    <w:rsid w:val="00212C13"/>
+    <w:rsid w:val="00D37C3A"/>
     <w:pPr>
       <w:spacing w:after="80" w:line="240" w:lineRule="auto"/>
       <w:contextualSpacing/>
@@ -868,7 +1294,7 @@
     <w:basedOn w:val="DefaultParagraphFont"/>
     <w:link w:val="Title"/>
     <w:uiPriority w:val="10"/>
-    <w:rsid w:val="00212C13"/>
+    <w:rsid w:val="00D37C3A"/>
     <w:rPr>
       <w:rFonts w:asciiTheme="majorHAnsi" w:eastAsiaTheme="majorEastAsia" w:hAnsiTheme="majorHAnsi" w:cstheme="majorBidi"/>
       <w:spacing w:val="-10"/>
@@ -884,7 +1310,7 @@
     <w:link w:val="SubtitleChar"/>
     <w:uiPriority w:val="11"/>
     <w:qFormat/>
-    <w:rsid w:val="00212C13"/>
+    <w:rsid w:val="00D37C3A"/>
     <w:pPr>
       <w:numPr>
         <w:ilvl w:val="1"/>
@@ -903,7 +1329,7 @@
     <w:basedOn w:val="DefaultParagraphFont"/>
     <w:link w:val="Subtitle"/>
     <w:uiPriority w:val="11"/>
-    <w:rsid w:val="00212C13"/>
+    <w:rsid w:val="00D37C3A"/>
     <w:rPr>
       <w:rFonts w:eastAsiaTheme="majorEastAsia" w:cstheme="majorBidi"/>
       <w:color w:val="595959" w:themeColor="text1" w:themeTint="A6"/>
@@ -919,7 +1345,7 @@
     <w:link w:val="QuoteChar"/>
     <w:uiPriority w:val="29"/>
     <w:qFormat/>
-    <w:rsid w:val="00212C13"/>
+    <w:rsid w:val="00D37C3A"/>
     <w:pPr>
       <w:spacing w:before="160"/>
       <w:jc w:val="center"/>
@@ -935,7 +1361,7 @@
     <w:basedOn w:val="DefaultParagraphFont"/>
     <w:link w:val="Quote"/>
     <w:uiPriority w:val="29"/>
-    <w:rsid w:val="00212C13"/>
+    <w:rsid w:val="00D37C3A"/>
     <w:rPr>
       <w:i/>
       <w:iCs/>
@@ -947,7 +1373,7 @@
     <w:basedOn w:val="Normal"/>
     <w:uiPriority w:val="34"/>
     <w:qFormat/>
-    <w:rsid w:val="00212C13"/>
+    <w:rsid w:val="00D37C3A"/>
     <w:pPr>
       <w:ind w:left="720"/>
       <w:contextualSpacing/>
@@ -958,7 +1384,7 @@
     <w:basedOn w:val="DefaultParagraphFont"/>
     <w:uiPriority w:val="21"/>
     <w:qFormat/>
-    <w:rsid w:val="00212C13"/>
+    <w:rsid w:val="00D37C3A"/>
     <w:rPr>
       <w:i/>
       <w:iCs/>
@@ -972,7 +1398,7 @@
     <w:link w:val="IntenseQuoteChar"/>
     <w:uiPriority w:val="30"/>
     <w:qFormat/>
-    <w:rsid w:val="00212C13"/>
+    <w:rsid w:val="00D37C3A"/>
     <w:pPr>
       <w:pBdr>
         <w:top w:val="single" w:sz="4" w:space="10" w:color="0F4761" w:themeColor="accent1" w:themeShade="BF"/>
@@ -993,7 +1419,7 @@
     <w:basedOn w:val="DefaultParagraphFont"/>
     <w:link w:val="IntenseQuote"/>
     <w:uiPriority w:val="30"/>
-    <w:rsid w:val="00212C13"/>
+    <w:rsid w:val="00D37C3A"/>
     <w:rPr>
       <w:i/>
       <w:iCs/>
@@ -1005,7 +1431,7 @@
     <w:basedOn w:val="DefaultParagraphFont"/>
     <w:uiPriority w:val="32"/>
     <w:qFormat/>
-    <w:rsid w:val="00212C13"/>
+    <w:rsid w:val="00D37C3A"/>
     <w:rPr>
       <w:b/>
       <w:bCs/>
@@ -1013,6 +1439,16 @@
       <w:color w:val="0F4761" w:themeColor="accent1" w:themeShade="BF"/>
       <w:spacing w:val="5"/>
     </w:rPr>
+  </w:style>
+  <w:style w:type="paragraph" w:styleId="Revision">
+    <w:name w:val="Revision"/>
+    <w:hidden/>
+    <w:uiPriority w:val="99"/>
+    <w:semiHidden/>
+    <w:rsid w:val="00D37C3A"/>
+    <w:pPr>
+      <w:spacing w:after="0" w:line="240" w:lineRule="auto"/>
+    </w:pPr>
   </w:style>
 </w:styles>
 </file>

</xml_diff>